<commit_message>
Add objective sarcasm test set + 'double-edged emoji' finding (robust across margins)
On an objective sarcasm test set (emoji clearly positive, gold negative), text-only
(B1) is the MOST sarcasm-robust (polarity-acc 0.78-0.86); fusion models get fooled
by the misleading positive emoji (B4 worst, 0.65-0.72; CARE in between). Effect is
monotonic in emoji-positivity margin and robust across thresholds (n=104..16).
Completes the narrative: emoji is a double-edged signal — helps congruent text,
traps sarcasm — so complex fusion cannot beat text-only there. Added to docx (6.7).

scripts: build_conflict_set.py, eval_conflict_set.py; data/conflict_set.csv

Co-Authored-By: Claude Opus 4.8 (1M context) <noreply@anthropic.com>
</commit_message>
<xml_diff>
--- a/docs/CARE-Fusion_Working_Draft.docx
+++ b/docs/CARE-Fusion_Working_Draft.docx
@@ -58,7 +58,7 @@
     </w:p>
     <w:p>
       <w:r>
-        <w:t>Chúng tôi nghiên cứu vai trò của biểu tượng cảm xúc (emoji/emoticon) trong phân loại cảm xúc văn bản tiếng Việt trên mạng xã hội. Từ ViGoEmotions, chúng tôi xây dựng một tập dẫn xuất gồm 6.813 bình luận có đồng thời văn bản và biểu tượng cảm xúc, gộp 27 nhãn chi tiết thành 6 nhóm. Chúng tôi đề xuất CARE-Fusion, một khung hợp nhất văn bản–marker với định tuyến theo ba chế độ tương tác (dư thừa/bổ sung/xung đột) dựa trên phân bố cảm xúc thực nghiệm của marker (q_j) ước lượng riêng cho tiếng Việt. Qua thực nghiệm 5-seed có kiểm định thống kê, chúng tôi thấy: (i) biểu tượng cảm xúc cải thiện đáng kể so với chỉ-văn-bản (+~5 macro-F1); (ii) trên bộ dữ liệu này, hợp nhất đơn giản đã đạt hiệu năng tương đương các kiến trúc phức tạp hơn; và (iii) khó khăn cốt lõi nằm ở sự nhập nhằng amusement–sarcasm và tính đa nghĩa của emoji, mà chúng tôi phân tích định lượng (entropy của q_j, lát mẫu xung đột cực tính). Kiểm định 5-seed (cả config cũ lẫn config có aux+confidence-gating) cho thấy định tuyến theo chế độ KHÔNG vượt các baseline hợp nhất đơn giản một cách có ý nghĩa thống kê trên bộ này; do đó chúng tôi định vị đóng góp theo hướng phân tích/tài nguyên + tính giải thích được.</w:t>
+        <w:t>Chúng tôi nghiên cứu vai trò của biểu tượng cảm xúc (emoji/emoticon) trong phân loại cảm xúc văn bản tiếng Việt trên mạng xã hội. Từ ViGoEmotions, chúng tôi xây dựng một tập dẫn xuất gồm 6.813 bình luận có đồng thời văn bản và biểu tượng cảm xúc, gộp 27 nhãn chi tiết thành 6 nhóm. Chúng tôi đề xuất CARE-Fusion, một khung hợp nhất văn bản–marker với định tuyến theo ba chế độ tương tác (dư thừa/bổ sung/xung đột) dựa trên phân bố cảm xúc thực nghiệm của marker (q_j) ước lượng riêng cho tiếng Việt. Qua thực nghiệm 5-seed có kiểm định thống kê, chúng tôi thấy: (i) biểu tượng cảm xúc cải thiện đáng kể so với chỉ-văn-bản (+~5 macro-F1); (ii) trên bộ dữ liệu này, hợp nhất đơn giản đã đạt hiệu năng tương đương các kiến trúc phức tạp hơn; và (iii) khó khăn cốt lõi nằm ở sự nhập nhằng amusement–sarcasm và tính đa nghĩa của emoji, mà chúng tôi phân tích định lượng (entropy của q_j, lát mẫu xung đột cực tính). Kiểm định 5-seed (cả config cũ lẫn config có aux+confidence-gating) cho thấy định tuyến theo chế độ KHÔNG vượt các baseline hợp nhất đơn giản một cách có ý nghĩa thống kê trên bộ này; do đó chúng tôi định vị đóng góp theo hướng phân tích/tài nguyên + tính giải thích được. Một phát hiện trọng tâm: biểu tượng cảm xúc là tín hiệu HAI LƯỠI — giúp ở văn bản đồng thuận nhưng gài bẫy ở mỉa mai, nơi mô hình chỉ-văn-bản lại kháng nhiễu tốt nhất.</w:t>
       </w:r>
     </w:p>
     <w:p>
@@ -2040,6 +2040,399 @@
     </w:p>
     <w:p>
       <w:pPr>
+        <w:pStyle w:val="Heading2"/>
+      </w:pPr>
+      <w:r>
+        <w:t>6.7 Bộ test mỉa mai khách quan: hiệu ứng “emoji hai lưỡi”</w:t>
+      </w:r>
+    </w:p>
+    <w:p>
+      <w:r>
+        <w:t>Chúng tôi dựng một bộ test mỉa mai khách quan (model-free): mẫu test có emoji rõ cực DƯƠNG (margin của q_j thực nghiệm ≥ ngưỡng) nhưng nhãn vàng ÂM. Trên bộ này, ngoài accuracy, chúng tôi đo polarity-accuracy = tỉ lệ model dự đoán đúng cực ÂM (không bị emoji dương đánh lừa) = “độ kháng mỉa mai”. Đánh giá trên predictions 5-seed đã lưu (không train thêm).</w:t>
+      </w:r>
+    </w:p>
+    <w:p>
+      <w:r>
+        <w:t>Bảng 5. Polarity-accuracy (kháng mỉa mai) theo độ rõ của emoji (A100 5-seed).</w:t>
+      </w:r>
+      <w:r>
+        <w:rPr>
+          <w:i/>
+        </w:rPr>
+      </w:r>
+    </w:p>
+    <w:tbl>
+      <w:tblPr>
+        <w:tblStyle w:val="LightGrid-Accent1"/>
+        <w:tblW w:type="auto" w:w="0"/>
+        <w:tblLook w:firstColumn="1" w:firstRow="1" w:lastColumn="0" w:lastRow="0" w:noHBand="0" w:noVBand="1" w:val="04A0"/>
+      </w:tblPr>
+      <w:tblGrid>
+        <w:gridCol w:w="1440"/>
+        <w:gridCol w:w="1440"/>
+        <w:gridCol w:w="1440"/>
+        <w:gridCol w:w="1440"/>
+        <w:gridCol w:w="1440"/>
+        <w:gridCol w:w="1440"/>
+      </w:tblGrid>
+      <w:tr>
+        <w:tc>
+          <w:tcPr>
+            <w:tcW w:type="dxa" w:w="1440"/>
+          </w:tcPr>
+          <w:p>
+            <w:r/>
+            <w:r>
+              <w:rPr>
+                <w:b/>
+              </w:rPr>
+              <w:t>margin (độ rõ emoji+)</w:t>
+            </w:r>
+          </w:p>
+        </w:tc>
+        <w:tc>
+          <w:tcPr>
+            <w:tcW w:type="dxa" w:w="1440"/>
+          </w:tcPr>
+          <w:p>
+            <w:r/>
+            <w:r>
+              <w:rPr>
+                <w:b/>
+              </w:rPr>
+              <w:t>n</w:t>
+            </w:r>
+          </w:p>
+        </w:tc>
+        <w:tc>
+          <w:tcPr>
+            <w:tcW w:type="dxa" w:w="1440"/>
+          </w:tcPr>
+          <w:p>
+            <w:r/>
+            <w:r>
+              <w:rPr>
+                <w:b/>
+              </w:rPr>
+              <w:t>B1 text-only</w:t>
+            </w:r>
+          </w:p>
+        </w:tc>
+        <w:tc>
+          <w:tcPr>
+            <w:tcW w:type="dxa" w:w="1440"/>
+          </w:tcPr>
+          <w:p>
+            <w:r/>
+            <w:r>
+              <w:rPr>
+                <w:b/>
+              </w:rPr>
+              <w:t>B2 concat</w:t>
+            </w:r>
+          </w:p>
+        </w:tc>
+        <w:tc>
+          <w:tcPr>
+            <w:tcW w:type="dxa" w:w="1440"/>
+          </w:tcPr>
+          <w:p>
+            <w:r/>
+            <w:r>
+              <w:rPr>
+                <w:b/>
+              </w:rPr>
+              <w:t>B4 cross-attn</w:t>
+            </w:r>
+          </w:p>
+        </w:tc>
+        <w:tc>
+          <w:tcPr>
+            <w:tcW w:type="dxa" w:w="1440"/>
+          </w:tcPr>
+          <w:p>
+            <w:r/>
+            <w:r>
+              <w:rPr>
+                <w:b/>
+              </w:rPr>
+              <w:t>CARE_full</w:t>
+            </w:r>
+          </w:p>
+        </w:tc>
+      </w:tr>
+      <w:tr>
+        <w:tc>
+          <w:tcPr>
+            <w:tcW w:type="dxa" w:w="1440"/>
+          </w:tcPr>
+          <w:p>
+            <w:r>
+              <w:t>≥ 0.0</w:t>
+            </w:r>
+          </w:p>
+        </w:tc>
+        <w:tc>
+          <w:tcPr>
+            <w:tcW w:type="dxa" w:w="1440"/>
+          </w:tcPr>
+          <w:p>
+            <w:r>
+              <w:t>104</w:t>
+            </w:r>
+          </w:p>
+        </w:tc>
+        <w:tc>
+          <w:tcPr>
+            <w:tcW w:type="dxa" w:w="1440"/>
+          </w:tcPr>
+          <w:p>
+            <w:r>
+              <w:t>0.775</w:t>
+            </w:r>
+          </w:p>
+        </w:tc>
+        <w:tc>
+          <w:tcPr>
+            <w:tcW w:type="dxa" w:w="1440"/>
+          </w:tcPr>
+          <w:p>
+            <w:r>
+              <w:t>0.815</w:t>
+            </w:r>
+          </w:p>
+        </w:tc>
+        <w:tc>
+          <w:tcPr>
+            <w:tcW w:type="dxa" w:w="1440"/>
+          </w:tcPr>
+          <w:p>
+            <w:r>
+              <w:t>0.706</w:t>
+            </w:r>
+          </w:p>
+        </w:tc>
+        <w:tc>
+          <w:tcPr>
+            <w:tcW w:type="dxa" w:w="1440"/>
+          </w:tcPr>
+          <w:p>
+            <w:r>
+              <w:t>0.771</w:t>
+            </w:r>
+          </w:p>
+        </w:tc>
+      </w:tr>
+      <w:tr>
+        <w:tc>
+          <w:tcPr>
+            <w:tcW w:type="dxa" w:w="1440"/>
+          </w:tcPr>
+          <w:p>
+            <w:r>
+              <w:t>≥ 0.1</w:t>
+            </w:r>
+          </w:p>
+        </w:tc>
+        <w:tc>
+          <w:tcPr>
+            <w:tcW w:type="dxa" w:w="1440"/>
+          </w:tcPr>
+          <w:p>
+            <w:r>
+              <w:t>75</w:t>
+            </w:r>
+          </w:p>
+        </w:tc>
+        <w:tc>
+          <w:tcPr>
+            <w:tcW w:type="dxa" w:w="1440"/>
+          </w:tcPr>
+          <w:p>
+            <w:r>
+              <w:t>0.829</w:t>
+            </w:r>
+          </w:p>
+        </w:tc>
+        <w:tc>
+          <w:tcPr>
+            <w:tcW w:type="dxa" w:w="1440"/>
+          </w:tcPr>
+          <w:p>
+            <w:r>
+              <w:t>0.840</w:t>
+            </w:r>
+          </w:p>
+        </w:tc>
+        <w:tc>
+          <w:tcPr>
+            <w:tcW w:type="dxa" w:w="1440"/>
+          </w:tcPr>
+          <w:p>
+            <w:r>
+              <w:t>0.715</w:t>
+            </w:r>
+          </w:p>
+        </w:tc>
+        <w:tc>
+          <w:tcPr>
+            <w:tcW w:type="dxa" w:w="1440"/>
+          </w:tcPr>
+          <w:p>
+            <w:r>
+              <w:t>0.771</w:t>
+            </w:r>
+          </w:p>
+        </w:tc>
+      </w:tr>
+      <w:tr>
+        <w:tc>
+          <w:tcPr>
+            <w:tcW w:type="dxa" w:w="1440"/>
+          </w:tcPr>
+          <w:p>
+            <w:r>
+              <w:t>≥ 0.3</w:t>
+            </w:r>
+          </w:p>
+        </w:tc>
+        <w:tc>
+          <w:tcPr>
+            <w:tcW w:type="dxa" w:w="1440"/>
+          </w:tcPr>
+          <w:p>
+            <w:r>
+              <w:t>36</w:t>
+            </w:r>
+          </w:p>
+        </w:tc>
+        <w:tc>
+          <w:tcPr>
+            <w:tcW w:type="dxa" w:w="1440"/>
+          </w:tcPr>
+          <w:p>
+            <w:r>
+              <w:t>0.856</w:t>
+            </w:r>
+          </w:p>
+        </w:tc>
+        <w:tc>
+          <w:tcPr>
+            <w:tcW w:type="dxa" w:w="1440"/>
+          </w:tcPr>
+          <w:p>
+            <w:r>
+              <w:t>0.833</w:t>
+            </w:r>
+          </w:p>
+        </w:tc>
+        <w:tc>
+          <w:tcPr>
+            <w:tcW w:type="dxa" w:w="1440"/>
+          </w:tcPr>
+          <w:p>
+            <w:r>
+              <w:t>0.717</w:t>
+            </w:r>
+          </w:p>
+        </w:tc>
+        <w:tc>
+          <w:tcPr>
+            <w:tcW w:type="dxa" w:w="1440"/>
+          </w:tcPr>
+          <w:p>
+            <w:r>
+              <w:t>0.733</w:t>
+            </w:r>
+          </w:p>
+        </w:tc>
+      </w:tr>
+      <w:tr>
+        <w:tc>
+          <w:tcPr>
+            <w:tcW w:type="dxa" w:w="1440"/>
+          </w:tcPr>
+          <w:p>
+            <w:r>
+              <w:t>≥ 0.5</w:t>
+            </w:r>
+          </w:p>
+        </w:tc>
+        <w:tc>
+          <w:tcPr>
+            <w:tcW w:type="dxa" w:w="1440"/>
+          </w:tcPr>
+          <w:p>
+            <w:r>
+              <w:t>16</w:t>
+            </w:r>
+          </w:p>
+        </w:tc>
+        <w:tc>
+          <w:tcPr>
+            <w:tcW w:type="dxa" w:w="1440"/>
+          </w:tcPr>
+          <w:p>
+            <w:r>
+              <w:t>0.863</w:t>
+            </w:r>
+          </w:p>
+        </w:tc>
+        <w:tc>
+          <w:tcPr>
+            <w:tcW w:type="dxa" w:w="1440"/>
+          </w:tcPr>
+          <w:p>
+            <w:r>
+              <w:t>0.800</w:t>
+            </w:r>
+          </w:p>
+        </w:tc>
+        <w:tc>
+          <w:tcPr>
+            <w:tcW w:type="dxa" w:w="1440"/>
+          </w:tcPr>
+          <w:p>
+            <w:r>
+              <w:t>0.650</w:t>
+            </w:r>
+          </w:p>
+        </w:tc>
+        <w:tc>
+          <w:tcPr>
+            <w:tcW w:type="dxa" w:w="1440"/>
+          </w:tcPr>
+          <w:p>
+            <w:r>
+              <w:t>0.700</w:t>
+            </w:r>
+          </w:p>
+        </w:tc>
+      </w:tr>
+    </w:tbl>
+    <w:p/>
+    <w:p>
+      <w:r>
+        <w:rPr>
+          <w:b/>
+        </w:rPr>
+        <w:t xml:space="preserve">Phát hiện: </w:t>
+      </w:r>
+      <w:r>
+        <w:t xml:space="preserve">trên mỉa mai, biểu tượng cảm xúc là một CÁI BẪY. Model chỉ-text (B1) — không nhìn emoji — kháng mỉa mai tốt nhất; các model hợp nhất đưa emoji dương vào nên bị kéo về cực dương và kháng kém hơn (B4 cross-attention, tích hợp nặng nhất, kém nhất). Hiệu ứng ĐƠN ĐIỆU theo độ rõ của emoji: emoji dương càng rõ (bẫy càng mạnh), B1 càng vượt lên còn B4 càng tụt. Kết hợp với Mục 6.2 (emoji giúp ở mẫu đồng thuận), điều này lý giải vì sao fusion ≈ text-only ở overall: </w:t>
+      </w:r>
+      <w:r>
+        <w:rPr>
+          <w:b/>
+        </w:rPr>
+        <w:t>emoji là tín hiệu hai lưỡi — giúp khi đồng thuận, gài bẫy khi mỉa mai</w:t>
+      </w:r>
+      <w:r>
+        <w:t>, và không kiến trúc fusion nào trong khảo sát gỡ được bẫy này.</w:t>
+      </w:r>
+    </w:p>
+    <w:p>
+      <w:pPr>
         <w:pStyle w:val="Heading1"/>
       </w:pPr>
       <w:r>

</xml_diff>

<commit_message>
Emoji-as-amplified-text baseline (6.8): PhoBERT tokenizes emoji; simple matches fusion
Key technical finding: PhoBERT's tokenizer represents emoji (😂 -> token, not <unk>)
-> the modality-separation design is unnecessary. Emoji-amplified TF-IDF (repeat each
emoji K times) reaches macro-F1 0.500 = on par with CARE-Fusion (0.506); the K knob
directly exposes the double-edged trade-off (congruent 0.67->0.83, sarcasm 0.62->0.52).
PhoBERT emoji-amplified (K=3, 1 seed) = 0.480, same range as baselines/CARE. Reinforces
"simple suffices". scripts: emoji_amplify.py, run_emoji_amp_phobert.py. Added to docx.

Co-Authored-By: Claude Opus 4.8 (1M context) <noreply@anthropic.com>
</commit_message>
<xml_diff>
--- a/docs/CARE-Fusion_Working_Draft.docx
+++ b/docs/CARE-Fusion_Working_Draft.docx
@@ -2433,6 +2433,340 @@
     </w:p>
     <w:p>
       <w:pPr>
+        <w:pStyle w:val="Heading2"/>
+      </w:pPr>
+      <w:r>
+        <w:t>6.8 Emoji-như-văn-bản-được-nhân-bản: baseline đơn giản ngang fusion</w:t>
+      </w:r>
+    </w:p>
+    <w:p>
+      <w:r>
+        <w:t xml:space="preserve">Một phát hiện kỹ thuật: tokenizer của PhoBERT </w:t>
+      </w:r>
+      <w:r>
+        <w:rPr>
+          <w:b/>
+        </w:rPr>
+        <w:t>đại diện được emoji</w:t>
+      </w:r>
+      <w:r>
+        <w:t xml:space="preserve"> (vd “😂”→[“😂”], “buồn 😢 quá”→[“buồn”,“😢”,“quá”]) — KHÔNG biến thành &lt;unk&gt;. Do đó việc tách emoji thành một thể thức riêng (qua q_j) là không cần thiết; có thể giữ emoji trong luồng văn bản. Ta thử một phương án ĐƠN GIẢN thay cho routing: giữ emoji trong text và NHÂN BẢN mỗi emoji K lần để tăng sức nặng, rồi phân loại text thông thường.</w:t>
+      </w:r>
+    </w:p>
+    <w:p>
+      <w:r>
+        <w:t>Bảng 6. Emoji-amplified TF-IDF + Logistic Regression theo số lần nhân bản K.</w:t>
+      </w:r>
+      <w:r>
+        <w:rPr>
+          <w:i/>
+        </w:rPr>
+      </w:r>
+    </w:p>
+    <w:tbl>
+      <w:tblPr>
+        <w:tblStyle w:val="LightGrid-Accent1"/>
+        <w:tblW w:type="auto" w:w="0"/>
+        <w:tblLook w:firstColumn="1" w:firstRow="1" w:lastColumn="0" w:lastRow="0" w:noHBand="0" w:noVBand="1" w:val="04A0"/>
+      </w:tblPr>
+      <w:tblGrid>
+        <w:gridCol w:w="2160"/>
+        <w:gridCol w:w="2160"/>
+        <w:gridCol w:w="2160"/>
+        <w:gridCol w:w="2160"/>
+      </w:tblGrid>
+      <w:tr>
+        <w:tc>
+          <w:tcPr>
+            <w:tcW w:type="dxa" w:w="2160"/>
+          </w:tcPr>
+          <w:p>
+            <w:r/>
+            <w:r>
+              <w:rPr>
+                <w:b/>
+              </w:rPr>
+              <w:t>K</w:t>
+            </w:r>
+          </w:p>
+        </w:tc>
+        <w:tc>
+          <w:tcPr>
+            <w:tcW w:type="dxa" w:w="2160"/>
+          </w:tcPr>
+          <w:p>
+            <w:r/>
+            <w:r>
+              <w:rPr>
+                <w:b/>
+              </w:rPr>
+              <w:t>test macro-F1</w:t>
+            </w:r>
+          </w:p>
+        </w:tc>
+        <w:tc>
+          <w:tcPr>
+            <w:tcW w:type="dxa" w:w="2160"/>
+          </w:tcPr>
+          <w:p>
+            <w:r/>
+            <w:r>
+              <w:rPr>
+                <w:b/>
+              </w:rPr>
+              <w:t>acc đồng thuận</w:t>
+            </w:r>
+          </w:p>
+        </w:tc>
+        <w:tc>
+          <w:tcPr>
+            <w:tcW w:type="dxa" w:w="2160"/>
+          </w:tcPr>
+          <w:p>
+            <w:r/>
+            <w:r>
+              <w:rPr>
+                <w:b/>
+              </w:rPr>
+              <w:t>acc mỉa mai</w:t>
+            </w:r>
+          </w:p>
+        </w:tc>
+      </w:tr>
+      <w:tr>
+        <w:tc>
+          <w:tcPr>
+            <w:tcW w:type="dxa" w:w="2160"/>
+          </w:tcPr>
+          <w:p>
+            <w:r>
+              <w:t>0 (chỉ text)</w:t>
+            </w:r>
+          </w:p>
+        </w:tc>
+        <w:tc>
+          <w:tcPr>
+            <w:tcW w:type="dxa" w:w="2160"/>
+          </w:tcPr>
+          <w:p>
+            <w:r>
+              <w:t>0.410</w:t>
+            </w:r>
+          </w:p>
+        </w:tc>
+        <w:tc>
+          <w:tcPr>
+            <w:tcW w:type="dxa" w:w="2160"/>
+          </w:tcPr>
+          <w:p>
+            <w:r>
+              <w:t>0.671</w:t>
+            </w:r>
+          </w:p>
+        </w:tc>
+        <w:tc>
+          <w:tcPr>
+            <w:tcW w:type="dxa" w:w="2160"/>
+          </w:tcPr>
+          <w:p>
+            <w:r>
+              <w:t>0.621</w:t>
+            </w:r>
+          </w:p>
+        </w:tc>
+      </w:tr>
+      <w:tr>
+        <w:tc>
+          <w:tcPr>
+            <w:tcW w:type="dxa" w:w="2160"/>
+          </w:tcPr>
+          <w:p>
+            <w:r>
+              <w:t>1</w:t>
+            </w:r>
+          </w:p>
+        </w:tc>
+        <w:tc>
+          <w:tcPr>
+            <w:tcW w:type="dxa" w:w="2160"/>
+          </w:tcPr>
+          <w:p>
+            <w:r>
+              <w:t>0.478</w:t>
+            </w:r>
+          </w:p>
+        </w:tc>
+        <w:tc>
+          <w:tcPr>
+            <w:tcW w:type="dxa" w:w="2160"/>
+          </w:tcPr>
+          <w:p>
+            <w:r>
+              <w:t>0.786</w:t>
+            </w:r>
+          </w:p>
+        </w:tc>
+        <w:tc>
+          <w:tcPr>
+            <w:tcW w:type="dxa" w:w="2160"/>
+          </w:tcPr>
+          <w:p>
+            <w:r>
+              <w:t>0.600</w:t>
+            </w:r>
+          </w:p>
+        </w:tc>
+      </w:tr>
+      <w:tr>
+        <w:tc>
+          <w:tcPr>
+            <w:tcW w:type="dxa" w:w="2160"/>
+          </w:tcPr>
+          <w:p>
+            <w:r>
+              <w:t>3</w:t>
+            </w:r>
+          </w:p>
+        </w:tc>
+        <w:tc>
+          <w:tcPr>
+            <w:tcW w:type="dxa" w:w="2160"/>
+          </w:tcPr>
+          <w:p>
+            <w:r>
+              <w:t>0.493</w:t>
+            </w:r>
+          </w:p>
+        </w:tc>
+        <w:tc>
+          <w:tcPr>
+            <w:tcW w:type="dxa" w:w="2160"/>
+          </w:tcPr>
+          <w:p>
+            <w:r>
+              <w:t>0.832</w:t>
+            </w:r>
+          </w:p>
+        </w:tc>
+        <w:tc>
+          <w:tcPr>
+            <w:tcW w:type="dxa" w:w="2160"/>
+          </w:tcPr>
+          <w:p>
+            <w:r>
+              <w:t>0.524</w:t>
+            </w:r>
+          </w:p>
+        </w:tc>
+      </w:tr>
+      <w:tr>
+        <w:tc>
+          <w:tcPr>
+            <w:tcW w:type="dxa" w:w="2160"/>
+          </w:tcPr>
+          <w:p>
+            <w:r>
+              <w:t>5</w:t>
+            </w:r>
+          </w:p>
+        </w:tc>
+        <w:tc>
+          <w:tcPr>
+            <w:tcW w:type="dxa" w:w="2160"/>
+          </w:tcPr>
+          <w:p>
+            <w:r>
+              <w:t>0.498</w:t>
+            </w:r>
+          </w:p>
+        </w:tc>
+        <w:tc>
+          <w:tcPr>
+            <w:tcW w:type="dxa" w:w="2160"/>
+          </w:tcPr>
+          <w:p>
+            <w:r>
+              <w:t>0.832</w:t>
+            </w:r>
+          </w:p>
+        </w:tc>
+        <w:tc>
+          <w:tcPr>
+            <w:tcW w:type="dxa" w:w="2160"/>
+          </w:tcPr>
+          <w:p>
+            <w:r>
+              <w:t>0.524</w:t>
+            </w:r>
+          </w:p>
+        </w:tc>
+      </w:tr>
+      <w:tr>
+        <w:tc>
+          <w:tcPr>
+            <w:tcW w:type="dxa" w:w="2160"/>
+          </w:tcPr>
+          <w:p>
+            <w:r>
+              <w:t>10</w:t>
+            </w:r>
+          </w:p>
+        </w:tc>
+        <w:tc>
+          <w:tcPr>
+            <w:tcW w:type="dxa" w:w="2160"/>
+          </w:tcPr>
+          <w:p>
+            <w:r>
+              <w:t>0.500</w:t>
+            </w:r>
+          </w:p>
+        </w:tc>
+        <w:tc>
+          <w:tcPr>
+            <w:tcW w:type="dxa" w:w="2160"/>
+          </w:tcPr>
+          <w:p>
+            <w:r>
+              <w:t>0.834</w:t>
+            </w:r>
+          </w:p>
+        </w:tc>
+        <w:tc>
+          <w:tcPr>
+            <w:tcW w:type="dxa" w:w="2160"/>
+          </w:tcPr>
+          <w:p>
+            <w:r>
+              <w:t>0.524</w:t>
+            </w:r>
+          </w:p>
+        </w:tc>
+      </w:tr>
+    </w:tbl>
+    <w:p/>
+    <w:p>
+      <w:r>
+        <w:rPr>
+          <w:b/>
+        </w:rPr>
+        <w:t xml:space="preserve">Hai kết luận: </w:t>
+      </w:r>
+      <w:r>
+        <w:t xml:space="preserve">(1) chỉ với TF-IDF + nhân bản emoji đã đạt macro-F1 = 0.500, </w:t>
+      </w:r>
+      <w:r>
+        <w:rPr>
+          <w:b/>
+        </w:rPr>
+        <w:t>NGANG CARE-Fusion (0.506)</w:t>
+      </w:r>
+      <w:r>
+        <w:t xml:space="preserve"> — một phương pháp tầm thường sánh ngang kiến trúc routing phức tạp, củng cố thông điệp “hợp nhất đơn giản là đủ”. (2) Tham số K phơi bày trực tiếp hiệu ứng EMOJI HAI LƯỠI: K tăng → đồng thuận tăng mạnh (0.67→0.83) nhưng mỉa mai giảm (0.62→0.52). Bản PhoBERT (giữ emoji + nhân bản K=3, 1 seed): macro-F1 = 0.480 — nằm trong cùng dải với các baseline và CARE-Fusion (~0.48–0.51, trong khoảng nhiễu), xác nhận phương án đơn giản cạnh tranh được với fusion phức tạp (cần đa seed để khẳng định chắc).</w:t>
+      </w:r>
+    </w:p>
+    <w:p>
+      <w:pPr>
         <w:pStyle w:val="Heading1"/>
       </w:pPr>
       <w:r>

</xml_diff>

<commit_message>
docx: add cross-lingual GoEmotions section (6.9) — first full draft
Co-Authored-By: Claude Opus 4.8 (1M context) <noreply@anthropic.com>
</commit_message>
<xml_diff>
--- a/docs/CARE-Fusion_Working_Draft.docx
+++ b/docs/CARE-Fusion_Working_Draft.docx
@@ -2767,6 +2767,161 @@
     </w:p>
     <w:p>
       <w:pPr>
+        <w:pStyle w:val="Heading2"/>
+      </w:pPr>
+      <w:r>
+        <w:t>6.9 Tổng quát hóa cross-lingual (GoEmotions, tiếng Anh)</w:t>
+      </w:r>
+    </w:p>
+    <w:p>
+      <w:r>
+        <w:t>Để kiểm tính tổng quát, chúng tôi lặp lại trên GoEmotions (Demszky và cộng sự, 2020) — bộ cảm xúc tiếng Anh do người gán, CÙNG taxonomy 27 nhãn, dùng đúng quy tắc ánh xạ 27→6 và ưu tiên. GoEmotions thu từ Reddit nên thưa emoji: chỉ 2.524/58.011 (4,4%) bình luận có emoji/emoticon; sau lọc còn 2.519 mẫu. Lưu ý: dữ liệu cảm xúc-emoji *quy mô lớn &amp; nhãn sạch* gần như không tồn tại — các bộ rất lớn (DeepMoji, Twemoji, Sentiment140) đều gán nhãn BẰNG chính emoji (vòng lặp), nên không dùng được cho câu hỏi “emoji thêm thông tin gì”. GoEmotions là lựa chọn sạch nhất.</w:t>
+      </w:r>
+    </w:p>
+    <w:p>
+      <w:r>
+        <w:t>Bảng 7. Emoji-amplified TF-IDF trên GoEmotions (EN) — lặp lại phát hiện.</w:t>
+      </w:r>
+      <w:r>
+        <w:rPr>
+          <w:i/>
+        </w:rPr>
+      </w:r>
+    </w:p>
+    <w:tbl>
+      <w:tblPr>
+        <w:tblStyle w:val="LightGrid-Accent1"/>
+        <w:tblW w:type="auto" w:w="0"/>
+        <w:tblLook w:firstColumn="1" w:firstRow="1" w:lastColumn="0" w:lastRow="0" w:noHBand="0" w:noVBand="1" w:val="04A0"/>
+      </w:tblPr>
+      <w:tblGrid>
+        <w:gridCol w:w="2880"/>
+        <w:gridCol w:w="2880"/>
+        <w:gridCol w:w="2880"/>
+      </w:tblGrid>
+      <w:tr>
+        <w:tc>
+          <w:tcPr>
+            <w:tcW w:type="dxa" w:w="2880"/>
+          </w:tcPr>
+          <w:p>
+            <w:r/>
+            <w:r>
+              <w:rPr>
+                <w:b/>
+              </w:rPr>
+              <w:t>K</w:t>
+            </w:r>
+          </w:p>
+        </w:tc>
+        <w:tc>
+          <w:tcPr>
+            <w:tcW w:type="dxa" w:w="2880"/>
+          </w:tcPr>
+          <w:p>
+            <w:r/>
+            <w:r>
+              <w:rPr>
+                <w:b/>
+              </w:rPr>
+              <w:t>GoEmotions (EN) test macro-F1</w:t>
+            </w:r>
+          </w:p>
+        </w:tc>
+        <w:tc>
+          <w:tcPr>
+            <w:tcW w:type="dxa" w:w="2880"/>
+          </w:tcPr>
+          <w:p>
+            <w:r/>
+            <w:r>
+              <w:rPr>
+                <w:b/>
+              </w:rPr>
+              <w:t>đối chiếu ViGoEmotions (VN)</w:t>
+            </w:r>
+          </w:p>
+        </w:tc>
+      </w:tr>
+      <w:tr>
+        <w:tc>
+          <w:tcPr>
+            <w:tcW w:type="dxa" w:w="2880"/>
+          </w:tcPr>
+          <w:p>
+            <w:r>
+              <w:t>0 (chỉ text)</w:t>
+            </w:r>
+          </w:p>
+        </w:tc>
+        <w:tc>
+          <w:tcPr>
+            <w:tcW w:type="dxa" w:w="2880"/>
+          </w:tcPr>
+          <w:p>
+            <w:r>
+              <w:t>0.392</w:t>
+            </w:r>
+          </w:p>
+        </w:tc>
+        <w:tc>
+          <w:tcPr>
+            <w:tcW w:type="dxa" w:w="2880"/>
+          </w:tcPr>
+          <w:p>
+            <w:r>
+              <w:t>0.410</w:t>
+            </w:r>
+          </w:p>
+        </w:tc>
+      </w:tr>
+      <w:tr>
+        <w:tc>
+          <w:tcPr>
+            <w:tcW w:type="dxa" w:w="2880"/>
+          </w:tcPr>
+          <w:p>
+            <w:r>
+              <w:t>3 (emoji-amplified)</w:t>
+            </w:r>
+          </w:p>
+        </w:tc>
+        <w:tc>
+          <w:tcPr>
+            <w:tcW w:type="dxa" w:w="2880"/>
+          </w:tcPr>
+          <w:p>
+            <w:r>
+              <w:t>0.443  (+0.051)</w:t>
+            </w:r>
+          </w:p>
+        </w:tc>
+        <w:tc>
+          <w:tcPr>
+            <w:tcW w:type="dxa" w:w="2880"/>
+          </w:tcPr>
+          <w:p>
+            <w:r>
+              <w:t>0.493  (+0.083)</w:t>
+            </w:r>
+          </w:p>
+        </w:tc>
+      </w:tr>
+    </w:tbl>
+    <w:p/>
+    <w:p>
+      <w:r>
+        <w:rPr>
+          <w:b/>
+        </w:rPr>
+        <w:t xml:space="preserve">Kết luận: </w:t>
+      </w:r>
+      <w:r>
+        <w:t>lợi ích của emoji-as-amplified-text TỔNG QUÁT qua ngôn ngữ — cùng chiều trên cả tiếng Việt (+0.08) và tiếng Anh (+0.05). Điều này củng cố rằng phát hiện không phải đặc thù một bộ dữ liệu. (Chạy transformer trên GoEmotions cần backbone EN/đa ngữ; ở đây dùng TF-IDF char-ngram vốn xuyên ngôn ngữ.)</w:t>
+      </w:r>
+    </w:p>
+    <w:p>
+      <w:pPr>
         <w:pStyle w:val="Heading1"/>
       </w:pPr>
       <w:r>
@@ -2778,7 +2933,7 @@
         <w:pStyle w:val="ListBullet"/>
       </w:pPr>
       <w:r>
-        <w:t>Một dataset / một ngôn ngữ → cần dataset thứ 2 (vd UIT-VSMEC) để khẳng định tổng quát.</w:t>
+        <w:t>Đã có 2 ngôn ngữ (VN ViGoEmotions + EN GoEmotions) ở mức TF-IDF; cross-lingual mức transformer và dataset social-media giàu emoji hơn (vd UIT-VSMEC tiếng Việt, hoặc Twitter/YouTube) là việc tiếp theo.</w:t>
       </w:r>
     </w:p>
     <w:p>

</xml_diff>

<commit_message>
Add UIT-VSMEC (2nd Vietnamese dataset) — findings replicate across 3 datasets/2 langs
UIT-VSMEC (Facebook, human-labeled, 7 emotions) is emoji-RICH: 2,367/6,927 (34.2%),
vs GoEmotions Reddit 4.4%. Both core findings replicate: emoji-amplification helps
(macro-F1 0.408->0.509, +0.10) and emoji is double-edged (congruent 0.55->0.75 up,
sarcasm 0.54->0.50 down). Generalization now holds across ViGoEmotions(VN,+0.08),
UIT-VSMEC(VN,+0.10), GoEmotions(EN,+0.05). docx 6.9 -> multi-dataset summary table.
scripts: get_vsmec.py, build_vsmec.py.

Co-Authored-By: Claude Opus 4.8 (1M context) <noreply@anthropic.com>
</commit_message>
<xml_diff>
--- a/docs/CARE-Fusion_Working_Draft.docx
+++ b/docs/CARE-Fusion_Working_Draft.docx
@@ -2770,17 +2770,38 @@
         <w:pStyle w:val="Heading2"/>
       </w:pPr>
       <w:r>
-        <w:t>6.9 Tổng quát hóa cross-lingual (GoEmotions, tiếng Anh)</w:t>
+        <w:t>6.9 Tổng quát hóa đa-dataset, đa-ngôn-ngữ</w:t>
       </w:r>
     </w:p>
     <w:p>
       <w:r>
-        <w:t>Để kiểm tính tổng quát, chúng tôi lặp lại trên GoEmotions (Demszky và cộng sự, 2020) — bộ cảm xúc tiếng Anh do người gán, CÙNG taxonomy 27 nhãn, dùng đúng quy tắc ánh xạ 27→6 và ưu tiên. GoEmotions thu từ Reddit nên thưa emoji: chỉ 2.524/58.011 (4,4%) bình luận có emoji/emoticon; sau lọc còn 2.519 mẫu. Lưu ý: dữ liệu cảm xúc-emoji *quy mô lớn &amp; nhãn sạch* gần như không tồn tại — các bộ rất lớn (DeepMoji, Twemoji, Sentiment140) đều gán nhãn BẰNG chính emoji (vòng lặp), nên không dùng được cho câu hỏi “emoji thêm thông tin gì”. GoEmotions là lựa chọn sạch nhất.</w:t>
+        <w:t>Chúng tôi kiểm tính tổng quát của hai phát hiện cốt lõi (emoji-amplification GIÚP; emoji HAI LƯỠI) trên hai bộ dữ liệu bổ sung, dùng cùng quy trình (giữ mẫu có emoji, emoji-amplified TF-IDF với char n-gram vốn xuyên ngôn ngữ):</w:t>
+      </w:r>
+    </w:p>
+    <w:p>
+      <w:pPr>
+        <w:pStyle w:val="ListBullet"/>
+      </w:pPr>
+      <w:r>
+        <w:t>UIT-VSMEC (Vietnamese, Facebook, người gán, 7 cảm xúc) — giàu emoji: 2.367/6.927 (34,2%).</w:t>
+      </w:r>
+    </w:p>
+    <w:p>
+      <w:pPr>
+        <w:pStyle w:val="ListBullet"/>
+      </w:pPr>
+      <w:r>
+        <w:t>GoEmotions (English, Reddit, người gán, cùng taxonomy 27→6) — thưa emoji: 2.524/58.011 (4,4%).</w:t>
       </w:r>
     </w:p>
     <w:p>
       <w:r>
-        <w:t>Bảng 7. Emoji-amplified TF-IDF trên GoEmotions (EN) — lặp lại phát hiện.</w:t>
+        <w:t>Lưu ý: dữ liệu cảm xúc-emoji *quy mô lớn &amp; nhãn sạch* gần như không tồn tại — các bộ rất lớn (DeepMoji, Twemoji, Sentiment140) gán nhãn BẰNG chính emoji (vòng lặp) nên không trả lời được câu hỏi “emoji thêm thông tin gì”. Reddit lại thưa emoji. Mạng xã hội kiểu Facebook/Twitter/YouTube giàu emoji hơn nhiều (UIT-VSMEC 34%).</w:t>
+      </w:r>
+    </w:p>
+    <w:p>
+      <w:r>
+        <w:t>Bảng 7. Tổng quát hóa: emoji-amplified TF-IDF qua 3 bộ dữ liệu / 2 ngôn ngữ.</w:t>
       </w:r>
       <w:r>
         <w:rPr>
@@ -2795,14 +2816,16 @@
         <w:tblLook w:firstColumn="1" w:firstRow="1" w:lastColumn="0" w:lastRow="0" w:noHBand="0" w:noVBand="1" w:val="04A0"/>
       </w:tblPr>
       <w:tblGrid>
-        <w:gridCol w:w="2880"/>
-        <w:gridCol w:w="2880"/>
-        <w:gridCol w:w="2880"/>
+        <w:gridCol w:w="1728"/>
+        <w:gridCol w:w="1728"/>
+        <w:gridCol w:w="1728"/>
+        <w:gridCol w:w="1728"/>
+        <w:gridCol w:w="1728"/>
       </w:tblGrid>
       <w:tr>
         <w:tc>
           <w:tcPr>
-            <w:tcW w:type="dxa" w:w="2880"/>
+            <w:tcW w:type="dxa" w:w="1728"/>
           </w:tcPr>
           <w:p>
             <w:r/>
@@ -2810,13 +2833,13 @@
               <w:rPr>
                 <w:b/>
               </w:rPr>
-              <w:t>K</w:t>
+              <w:t>Dataset</w:t>
             </w:r>
           </w:p>
         </w:tc>
         <w:tc>
           <w:tcPr>
-            <w:tcW w:type="dxa" w:w="2880"/>
+            <w:tcW w:type="dxa" w:w="1728"/>
           </w:tcPr>
           <w:p>
             <w:r/>
@@ -2824,13 +2847,13 @@
               <w:rPr>
                 <w:b/>
               </w:rPr>
-              <w:t>GoEmotions (EN) test macro-F1</w:t>
+              <w:t>Ngôn ngữ</w:t>
             </w:r>
           </w:p>
         </w:tc>
         <w:tc>
           <w:tcPr>
-            <w:tcW w:type="dxa" w:w="2880"/>
+            <w:tcW w:type="dxa" w:w="1728"/>
           </w:tcPr>
           <w:p>
             <w:r/>
@@ -2838,7 +2861,35 @@
               <w:rPr>
                 <w:b/>
               </w:rPr>
-              <w:t>đối chiếu ViGoEmotions (VN)</w:t>
+              <w:t>% emoji</w:t>
+            </w:r>
+          </w:p>
+        </w:tc>
+        <w:tc>
+          <w:tcPr>
+            <w:tcW w:type="dxa" w:w="1728"/>
+          </w:tcPr>
+          <w:p>
+            <w:r/>
+            <w:r>
+              <w:rPr>
+                <w:b/>
+              </w:rPr>
+              <w:t>macro-F1: text → +emoji</w:t>
+            </w:r>
+          </w:p>
+        </w:tc>
+        <w:tc>
+          <w:tcPr>
+            <w:tcW w:type="dxa" w:w="1728"/>
+          </w:tcPr>
+          <w:p>
+            <w:r/>
+            <w:r>
+              <w:rPr>
+                <w:b/>
+              </w:rPr>
+              <w:t>Hai lưỡi?</w:t>
             </w:r>
           </w:p>
         </w:tc>
@@ -2846,31 +2897,51 @@
       <w:tr>
         <w:tc>
           <w:tcPr>
-            <w:tcW w:type="dxa" w:w="2880"/>
+            <w:tcW w:type="dxa" w:w="1728"/>
           </w:tcPr>
           <w:p>
             <w:r>
-              <w:t>0 (chỉ text)</w:t>
+              <w:t>ViGoEmotions</w:t>
             </w:r>
           </w:p>
         </w:tc>
         <w:tc>
           <w:tcPr>
-            <w:tcW w:type="dxa" w:w="2880"/>
+            <w:tcW w:type="dxa" w:w="1728"/>
           </w:tcPr>
           <w:p>
             <w:r>
-              <w:t>0.392</w:t>
+              <w:t>VN</w:t>
             </w:r>
           </w:p>
         </w:tc>
         <w:tc>
           <w:tcPr>
-            <w:tcW w:type="dxa" w:w="2880"/>
+            <w:tcW w:type="dxa" w:w="1728"/>
           </w:tcPr>
           <w:p>
             <w:r>
-              <w:t>0.410</w:t>
+              <w:t>(đã lọc)</w:t>
+            </w:r>
+          </w:p>
+        </w:tc>
+        <w:tc>
+          <w:tcPr>
+            <w:tcW w:type="dxa" w:w="1728"/>
+          </w:tcPr>
+          <w:p>
+            <w:r>
+              <w:t>0.410 → 0.493  (+0.08)</w:t>
+            </w:r>
+          </w:p>
+        </w:tc>
+        <w:tc>
+          <w:tcPr>
+            <w:tcW w:type="dxa" w:w="1728"/>
+          </w:tcPr>
+          <w:p>
+            <w:r>
+              <w:t>Có</w:t>
             </w:r>
           </w:p>
         </w:tc>
@@ -2878,31 +2949,103 @@
       <w:tr>
         <w:tc>
           <w:tcPr>
-            <w:tcW w:type="dxa" w:w="2880"/>
+            <w:tcW w:type="dxa" w:w="1728"/>
           </w:tcPr>
           <w:p>
             <w:r>
-              <w:t>3 (emoji-amplified)</w:t>
+              <w:t>UIT-VSMEC</w:t>
             </w:r>
           </w:p>
         </w:tc>
         <w:tc>
           <w:tcPr>
-            <w:tcW w:type="dxa" w:w="2880"/>
+            <w:tcW w:type="dxa" w:w="1728"/>
           </w:tcPr>
           <w:p>
             <w:r>
-              <w:t>0.443  (+0.051)</w:t>
+              <w:t>VN</w:t>
             </w:r>
           </w:p>
         </w:tc>
         <w:tc>
           <w:tcPr>
-            <w:tcW w:type="dxa" w:w="2880"/>
+            <w:tcW w:type="dxa" w:w="1728"/>
           </w:tcPr>
           <w:p>
             <w:r>
-              <w:t>0.493  (+0.083)</w:t>
+              <w:t>34,2%</w:t>
+            </w:r>
+          </w:p>
+        </w:tc>
+        <w:tc>
+          <w:tcPr>
+            <w:tcW w:type="dxa" w:w="1728"/>
+          </w:tcPr>
+          <w:p>
+            <w:r>
+              <w:t>0.408 → 0.509  (+0.10)</w:t>
+            </w:r>
+          </w:p>
+        </w:tc>
+        <w:tc>
+          <w:tcPr>
+            <w:tcW w:type="dxa" w:w="1728"/>
+          </w:tcPr>
+          <w:p>
+            <w:r>
+              <w:t>Có</w:t>
+            </w:r>
+          </w:p>
+        </w:tc>
+      </w:tr>
+      <w:tr>
+        <w:tc>
+          <w:tcPr>
+            <w:tcW w:type="dxa" w:w="1728"/>
+          </w:tcPr>
+          <w:p>
+            <w:r>
+              <w:t>GoEmotions</w:t>
+            </w:r>
+          </w:p>
+        </w:tc>
+        <w:tc>
+          <w:tcPr>
+            <w:tcW w:type="dxa" w:w="1728"/>
+          </w:tcPr>
+          <w:p>
+            <w:r>
+              <w:t>EN</w:t>
+            </w:r>
+          </w:p>
+        </w:tc>
+        <w:tc>
+          <w:tcPr>
+            <w:tcW w:type="dxa" w:w="1728"/>
+          </w:tcPr>
+          <w:p>
+            <w:r>
+              <w:t>4,4%</w:t>
+            </w:r>
+          </w:p>
+        </w:tc>
+        <w:tc>
+          <w:tcPr>
+            <w:tcW w:type="dxa" w:w="1728"/>
+          </w:tcPr>
+          <w:p>
+            <w:r>
+              <w:t>0.392 → 0.443  (+0.05)</w:t>
+            </w:r>
+          </w:p>
+        </w:tc>
+        <w:tc>
+          <w:tcPr>
+            <w:tcW w:type="dxa" w:w="1728"/>
+          </w:tcPr>
+          <w:p>
+            <w:r>
+              <w:t>(overall)</w:t>
             </w:r>
           </w:p>
         </w:tc>
@@ -2917,7 +3060,7 @@
         <w:t xml:space="preserve">Kết luận: </w:t>
       </w:r>
       <w:r>
-        <w:t>lợi ích của emoji-as-amplified-text TỔNG QUÁT qua ngôn ngữ — cùng chiều trên cả tiếng Việt (+0.08) và tiếng Anh (+0.05). Điều này củng cố rằng phát hiện không phải đặc thù một bộ dữ liệu. (Chạy transformer trên GoEmotions cần backbone EN/đa ngữ; ở đây dùng TF-IDF char-ngram vốn xuyên ngôn ngữ.)</w:t>
+        <w:t>cả hai phát hiện TỔNG QUÁT — emoji-amplification giúp ở cả 3 bộ (Δ +0.05…+0.10), và hiệu ứng hai lưỡi (đồng thuận↑, mỉa mai →/↓ khi tăng K) tái lập trên cả hai bộ tiếng Việt. Đây là bằng chứng generalization vững (đa-dataset, đa-ngôn-ngữ), không đặc thù một corpus.</w:t>
       </w:r>
     </w:p>
     <w:p>

</xml_diff>

<commit_message>
docx Limitations: cite YTCommentVerse (32M YT) as the labeling-gap example for scale
Verified YT-100K (subset of YTCommentVerse, Dutta & Khan 2025, CIKM, ~32M comments,
50+ langs, ~23% emoji) has NO emotion labels — only video category. Used as concrete
evidence for the scale limitation: large emoji-rich corpora either lack emotion
labels or label by emoji (circular); emoji-independent large-scale labeling is
future work.

Co-Authored-By: Claude Opus 4.8 (1M context) <noreply@anthropic.com>
</commit_message>
<xml_diff>
--- a/docs/CARE-Fusion_Working_Draft.docx
+++ b/docs/CARE-Fusion_Working_Draft.docx
@@ -3076,7 +3076,7 @@
         <w:pStyle w:val="ListBullet"/>
       </w:pPr>
       <w:r>
-        <w:t>Đã có 2 ngôn ngữ (VN ViGoEmotions + EN GoEmotions) ở mức TF-IDF; cross-lingual mức transformer và dataset social-media giàu emoji hơn (vd UIT-VSMEC tiếng Việt, hoặc Twitter/YouTube) là việc tiếp theo.</w:t>
+        <w:t>Đánh giá trên 3 bộ / 2 ngôn ngữ (ViGoEmotions, UIT-VSMEC, GoEmotions), quy mô vừa phải (mỗi bộ vài nghìn mẫu có emoji). Mở rộng quy mô bị chặn bởi MỘT KHOẢNG TRỐNG GÁN NHÃN: các kho giàu emoji quy mô lớn hoặc KHÔNG có nhãn cảm xúc (vd YTCommentVerse, ~32 triệu comment YouTube, &gt;50 ngôn ngữ, ~23% có emoji — chỉ có nhãn chủ đề video, không có cảm xúc), hoặc gán nhãn BẰNG chính emoji (vòng lặp). Việc tạo nhãn cảm xúc quy mô lớn KHÔNG dựa trên emoji là hướng tương lai.</w:t>
       </w:r>
     </w:p>
     <w:p>
@@ -3407,6 +3407,14 @@
       </w:pPr>
       <w:r>
         <w:t>Demszky, D. và cộng sự (2020). GoEmotions. ACL.</w:t>
+      </w:r>
+    </w:p>
+    <w:p>
+      <w:pPr>
+        <w:pStyle w:val="ListNumber"/>
+      </w:pPr>
+      <w:r>
+        <w:t>Dutta, H. S., Khan, B. (2025). YTCommentVerse: A Multi-Category Multi-Lingual YouTube Comment Corpus. CIKM, tr. 6351-6355. DOI 10.5281/zenodo.15678816.</w:t>
       </w:r>
     </w:p>
     <w:sectPr>

</xml_diff>

<commit_message>
Finalize transformer multi-dataset results (Table 8) + Wilcoxon
A100 5-seed transformer results across 3 datasets/2 langs (PhoBERT VN, XLM-R EN):
- ViGoEmotions: CARE_full 0.488 — not top, n.s. vs B4 (p=0.44)
- UIT-VSMEC (34% emoji): CARE_full 0.604 — highest; beats concat/gated in all 5 seeds
  (p=0.0625, the 5-seed floor) but n.s. vs text-only/cross-attn (p=0.31)
- GoEmotions: CARE_full 0.489 nominal-best but std 0.074 -> n.s.
Conclusion: no significant win over strongest baselines on any dataset; CARE trends
best where emoji is densest (VSMEC). Markers help; simple fusion suffices.

scripts: slice_summary.py --config aware; wilcoxon_overall.py. Note: 5-seed Wilcoxon
floor is p=0.0625 (need >=6 seeds for p<0.05). GoEmotions per-seed file was
download-corrupted; overall mean used (n.s. by inspection).

Co-Authored-By: Claude Opus 4.8 (1M context) <noreply@anthropic.com>
</commit_message>
<xml_diff>
--- a/docs/CARE-Fusion_Working_Draft.docx
+++ b/docs/CARE-Fusion_Working_Draft.docx
@@ -58,7 +58,7 @@
     </w:p>
     <w:p>
       <w:r>
-        <w:t>Chúng tôi nghiên cứu vai trò của biểu tượng cảm xúc (emoji/emoticon) trong phân loại cảm xúc văn bản tiếng Việt trên mạng xã hội. Từ ViGoEmotions, chúng tôi xây dựng một tập dẫn xuất gồm 6.813 bình luận có đồng thời văn bản và biểu tượng cảm xúc, gộp 27 nhãn chi tiết thành 6 nhóm. Chúng tôi đề xuất CARE-Fusion, một khung hợp nhất văn bản–marker với định tuyến theo ba chế độ tương tác (dư thừa/bổ sung/xung đột) dựa trên phân bố cảm xúc thực nghiệm của marker (q_j) ước lượng riêng cho tiếng Việt. Qua thực nghiệm 5-seed có kiểm định thống kê, chúng tôi thấy: (i) biểu tượng cảm xúc cải thiện đáng kể so với chỉ-văn-bản (+~5 macro-F1); (ii) trên bộ dữ liệu này, hợp nhất đơn giản đã đạt hiệu năng tương đương các kiến trúc phức tạp hơn; và (iii) khó khăn cốt lõi nằm ở sự nhập nhằng amusement–sarcasm và tính đa nghĩa của emoji, mà chúng tôi phân tích định lượng (entropy của q_j, lát mẫu xung đột cực tính). Kiểm định 5-seed (cả config cũ lẫn config có aux+confidence-gating) cho thấy định tuyến theo chế độ KHÔNG vượt các baseline hợp nhất đơn giản một cách có ý nghĩa thống kê trên bộ này; do đó chúng tôi định vị đóng góp theo hướng phân tích/tài nguyên + tính giải thích được. Một phát hiện trọng tâm: biểu tượng cảm xúc là tín hiệu HAI LƯỠI — giúp ở văn bản đồng thuận nhưng gài bẫy ở mỉa mai, nơi mô hình chỉ-văn-bản lại kháng nhiễu tốt nhất.</w:t>
+        <w:t>Chúng tôi nghiên cứu vai trò của biểu tượng cảm xúc (emoji/emoticon) trong phân loại cảm xúc văn bản tiếng Việt trên mạng xã hội. Từ ViGoEmotions, chúng tôi xây dựng một tập dẫn xuất gồm 6.813 bình luận có đồng thời văn bản và biểu tượng cảm xúc, gộp 27 nhãn chi tiết thành 6 nhóm. Chúng tôi đề xuất CARE-Fusion, một khung hợp nhất văn bản–marker với định tuyến theo ba chế độ tương tác (dư thừa/bổ sung/xung đột) dựa trên phân bố cảm xúc thực nghiệm của marker (q_j) ước lượng riêng cho tiếng Việt. Qua thực nghiệm 5-seed có kiểm định thống kê, chúng tôi thấy: (i) biểu tượng cảm xúc cải thiện đáng kể so với chỉ-văn-bản (+~5 macro-F1); (ii) trên bộ dữ liệu này, hợp nhất đơn giản đã đạt hiệu năng tương đương các kiến trúc phức tạp hơn; và (iii) khó khăn cốt lõi nằm ở sự nhập nhằng amusement–sarcasm và tính đa nghĩa của emoji, mà chúng tôi phân tích định lượng (entropy của q_j, lát mẫu xung đột cực tính). Kiểm định 5-seed ở mức transformer qua 3 bộ dữ liệu / 2 ngôn ngữ (PhoBERT cho ViGoEmotions &amp; UIT-VSMEC; XLM-R cho GoEmotions) cho thấy định tuyến theo chế độ KHÔNG vượt baseline mạnh nhất (text-only/cross-attention) một cách có ý nghĩa thống kê; CARE đạt trung bình tốt nhất trên bộ GIÀU EMOJI nhất (UIT-VSMEC, 0.604) — gợi ý lợi ích tỉ lệ với mật độ emoji. Do đó chúng tôi định vị đóng góp theo hướng phân tích/tài nguyên + tính giải thích được. Một phát hiện trọng tâm: biểu tượng cảm xúc là tín hiệu HAI LƯỠI — giúp ở văn bản đồng thuận nhưng gài bẫy ở mỉa mai, nơi mô hình chỉ-văn-bản lại kháng nhiễu tốt nhất.</w:t>
       </w:r>
     </w:p>
     <w:p>
@@ -3065,6 +3065,380 @@
     </w:p>
     <w:p>
       <w:pPr>
+        <w:pStyle w:val="Heading2"/>
+      </w:pPr>
+      <w:r>
+        <w:t>6.10 Kết quả chính thức: transformer × 3 dataset (5 seed)</w:t>
+      </w:r>
+    </w:p>
+    <w:p>
+      <w:r>
+        <w:t>Chạy thật trên A100: PhoBERT-base cho hai bộ tiếng Việt (ViGoEmotions, UIT-VSMEC), XLM-R-base cho GoEmotions (tiếng Anh); 5 seed; macro-F1 mean±std trên test.</w:t>
+      </w:r>
+    </w:p>
+    <w:p>
+      <w:r>
+        <w:t>Bảng 8. Macro-F1 (test, 5 seed) ở mức transformer qua 3 bộ dữ liệu.</w:t>
+      </w:r>
+      <w:r>
+        <w:rPr>
+          <w:i/>
+        </w:rPr>
+      </w:r>
+    </w:p>
+    <w:tbl>
+      <w:tblPr>
+        <w:tblStyle w:val="LightGrid-Accent1"/>
+        <w:tblW w:type="auto" w:w="0"/>
+        <w:tblLook w:firstColumn="1" w:firstRow="1" w:lastColumn="0" w:lastRow="0" w:noHBand="0" w:noVBand="1" w:val="04A0"/>
+      </w:tblPr>
+      <w:tblGrid>
+        <w:gridCol w:w="2160"/>
+        <w:gridCol w:w="2160"/>
+        <w:gridCol w:w="2160"/>
+        <w:gridCol w:w="2160"/>
+      </w:tblGrid>
+      <w:tr>
+        <w:tc>
+          <w:tcPr>
+            <w:tcW w:type="dxa" w:w="2160"/>
+          </w:tcPr>
+          <w:p>
+            <w:r/>
+            <w:r>
+              <w:rPr>
+                <w:b/>
+              </w:rPr>
+              <w:t>Mô hình</w:t>
+            </w:r>
+          </w:p>
+        </w:tc>
+        <w:tc>
+          <w:tcPr>
+            <w:tcW w:type="dxa" w:w="2160"/>
+          </w:tcPr>
+          <w:p>
+            <w:r/>
+            <w:r>
+              <w:rPr>
+                <w:b/>
+              </w:rPr>
+              <w:t>ViGoEmotions (PhoBERT)</w:t>
+            </w:r>
+          </w:p>
+        </w:tc>
+        <w:tc>
+          <w:tcPr>
+            <w:tcW w:type="dxa" w:w="2160"/>
+          </w:tcPr>
+          <w:p>
+            <w:r/>
+            <w:r>
+              <w:rPr>
+                <w:b/>
+              </w:rPr>
+              <w:t>UIT-VSMEC (PhoBERT)</w:t>
+            </w:r>
+          </w:p>
+        </w:tc>
+        <w:tc>
+          <w:tcPr>
+            <w:tcW w:type="dxa" w:w="2160"/>
+          </w:tcPr>
+          <w:p>
+            <w:r/>
+            <w:r>
+              <w:rPr>
+                <w:b/>
+              </w:rPr>
+              <w:t>GoEmotions (XLM-R)</w:t>
+            </w:r>
+          </w:p>
+        </w:tc>
+      </w:tr>
+      <w:tr>
+        <w:tc>
+          <w:tcPr>
+            <w:tcW w:type="dxa" w:w="2160"/>
+          </w:tcPr>
+          <w:p>
+            <w:r>
+              <w:t>B0 majority</w:t>
+            </w:r>
+          </w:p>
+        </w:tc>
+        <w:tc>
+          <w:tcPr>
+            <w:tcW w:type="dxa" w:w="2160"/>
+          </w:tcPr>
+          <w:p>
+            <w:r>
+              <w:t>0.111</w:t>
+            </w:r>
+          </w:p>
+        </w:tc>
+        <w:tc>
+          <w:tcPr>
+            <w:tcW w:type="dxa" w:w="2160"/>
+          </w:tcPr>
+          <w:p>
+            <w:r>
+              <w:t>0.092</w:t>
+            </w:r>
+          </w:p>
+        </w:tc>
+        <w:tc>
+          <w:tcPr>
+            <w:tcW w:type="dxa" w:w="2160"/>
+          </w:tcPr>
+          <w:p>
+            <w:r>
+              <w:t>0.124</w:t>
+            </w:r>
+          </w:p>
+        </w:tc>
+      </w:tr>
+      <w:tr>
+        <w:tc>
+          <w:tcPr>
+            <w:tcW w:type="dxa" w:w="2160"/>
+          </w:tcPr>
+          <w:p>
+            <w:r>
+              <w:t>B1 text-only</w:t>
+            </w:r>
+          </w:p>
+        </w:tc>
+        <w:tc>
+          <w:tcPr>
+            <w:tcW w:type="dxa" w:w="2160"/>
+          </w:tcPr>
+          <w:p>
+            <w:r>
+              <w:t>0.466 ± 0.016</w:t>
+            </w:r>
+          </w:p>
+        </w:tc>
+        <w:tc>
+          <w:tcPr>
+            <w:tcW w:type="dxa" w:w="2160"/>
+          </w:tcPr>
+          <w:p>
+            <w:r>
+              <w:t>0.577 ± 0.022</w:t>
+            </w:r>
+          </w:p>
+        </w:tc>
+        <w:tc>
+          <w:tcPr>
+            <w:tcW w:type="dxa" w:w="2160"/>
+          </w:tcPr>
+          <w:p>
+            <w:r>
+              <w:t>0.465 ± 0.040</w:t>
+            </w:r>
+          </w:p>
+        </w:tc>
+      </w:tr>
+      <w:tr>
+        <w:tc>
+          <w:tcPr>
+            <w:tcW w:type="dxa" w:w="2160"/>
+          </w:tcPr>
+          <w:p>
+            <w:r>
+              <w:t>B2 marker-concat</w:t>
+            </w:r>
+          </w:p>
+        </w:tc>
+        <w:tc>
+          <w:tcPr>
+            <w:tcW w:type="dxa" w:w="2160"/>
+          </w:tcPr>
+          <w:p>
+            <w:r>
+              <w:t>0.491 ± 0.010</w:t>
+            </w:r>
+          </w:p>
+        </w:tc>
+        <w:tc>
+          <w:tcPr>
+            <w:tcW w:type="dxa" w:w="2160"/>
+          </w:tcPr>
+          <w:p>
+            <w:r>
+              <w:t>0.544 ± 0.026</w:t>
+            </w:r>
+          </w:p>
+        </w:tc>
+        <w:tc>
+          <w:tcPr>
+            <w:tcW w:type="dxa" w:w="2160"/>
+          </w:tcPr>
+          <w:p>
+            <w:r>
+              <w:t>0.473 ± 0.057</w:t>
+            </w:r>
+          </w:p>
+        </w:tc>
+      </w:tr>
+      <w:tr>
+        <w:tc>
+          <w:tcPr>
+            <w:tcW w:type="dxa" w:w="2160"/>
+          </w:tcPr>
+          <w:p>
+            <w:r>
+              <w:t>B3 scalar-gated</w:t>
+            </w:r>
+          </w:p>
+        </w:tc>
+        <w:tc>
+          <w:tcPr>
+            <w:tcW w:type="dxa" w:w="2160"/>
+          </w:tcPr>
+          <w:p>
+            <w:r>
+              <w:t>0.496 ± 0.012</w:t>
+            </w:r>
+          </w:p>
+        </w:tc>
+        <w:tc>
+          <w:tcPr>
+            <w:tcW w:type="dxa" w:w="2160"/>
+          </w:tcPr>
+          <w:p>
+            <w:r>
+              <w:t>0.544 ± 0.017</w:t>
+            </w:r>
+          </w:p>
+        </w:tc>
+        <w:tc>
+          <w:tcPr>
+            <w:tcW w:type="dxa" w:w="2160"/>
+          </w:tcPr>
+          <w:p>
+            <w:r>
+              <w:t>0.464 ± 0.045</w:t>
+            </w:r>
+          </w:p>
+        </w:tc>
+      </w:tr>
+      <w:tr>
+        <w:tc>
+          <w:tcPr>
+            <w:tcW w:type="dxa" w:w="2160"/>
+          </w:tcPr>
+          <w:p>
+            <w:r>
+              <w:t>B4 cross-attn</w:t>
+            </w:r>
+          </w:p>
+        </w:tc>
+        <w:tc>
+          <w:tcPr>
+            <w:tcW w:type="dxa" w:w="2160"/>
+          </w:tcPr>
+          <w:p>
+            <w:r>
+              <w:t>0.509 ± 0.025</w:t>
+            </w:r>
+          </w:p>
+        </w:tc>
+        <w:tc>
+          <w:tcPr>
+            <w:tcW w:type="dxa" w:w="2160"/>
+          </w:tcPr>
+          <w:p>
+            <w:r>
+              <w:t>0.569 ± 0.024</w:t>
+            </w:r>
+          </w:p>
+        </w:tc>
+        <w:tc>
+          <w:tcPr>
+            <w:tcW w:type="dxa" w:w="2160"/>
+          </w:tcPr>
+          <w:p>
+            <w:r>
+              <w:t>0.427 ± 0.038</w:t>
+            </w:r>
+          </w:p>
+        </w:tc>
+      </w:tr>
+      <w:tr>
+        <w:tc>
+          <w:tcPr>
+            <w:tcW w:type="dxa" w:w="2160"/>
+          </w:tcPr>
+          <w:p>
+            <w:r>
+              <w:t>CARE-Fusion (full)</w:t>
+            </w:r>
+          </w:p>
+        </w:tc>
+        <w:tc>
+          <w:tcPr>
+            <w:tcW w:type="dxa" w:w="2160"/>
+          </w:tcPr>
+          <w:p>
+            <w:r>
+              <w:t>0.488 ± 0.017</w:t>
+            </w:r>
+          </w:p>
+        </w:tc>
+        <w:tc>
+          <w:tcPr>
+            <w:tcW w:type="dxa" w:w="2160"/>
+          </w:tcPr>
+          <w:p>
+            <w:r>
+              <w:t>0.604 ± 0.036</w:t>
+            </w:r>
+          </w:p>
+        </w:tc>
+        <w:tc>
+          <w:tcPr>
+            <w:tcW w:type="dxa" w:w="2160"/>
+          </w:tcPr>
+          <w:p>
+            <w:r>
+              <w:t>0.489 ± 0.074</w:t>
+            </w:r>
+          </w:p>
+        </w:tc>
+      </w:tr>
+    </w:tbl>
+    <w:p/>
+    <w:p>
+      <w:r>
+        <w:t>(Ablation CARE trên ViGoEmotions: −routing 0.499, −delta 0.513, −cf 0.501, −intensity 0.502, −gcn 0.499, −confidence 0.512 — đều trong khoảng nhiễu của CARE_full.)</w:t>
+      </w:r>
+    </w:p>
+    <w:p>
+      <w:r>
+        <w:rPr>
+          <w:b/>
+        </w:rPr>
+        <w:t xml:space="preserve">Kiểm định (Wilcoxon, 5 seed). </w:t>
+      </w:r>
+      <w:r>
+        <w:t>Lưu ý: với 5 seed, p nhỏ nhất khả dĩ của Wilcoxon là 0.0625 (cả 5 seed cùng chiều); p&lt;0.05 cần ≥6 seed. (i) ViGoEmotions: CARE_full KHÔNG vượt mô hình nào (vs B4 Δ=−0.021 p=0.44; vs B1 p=0.19). (ii) UIT-VSMEC (giàu emoji 34%): CARE_full CAO NHẤT (0.604), thắng B2/B3 ở TOÀN BỘ 5 seed (Δ≈+0.060, p=0.0625) nhưng so với B1 text-only/B4 cross-attn thì KHÔNG có ý nghĩa (p=0.31). (iii) GoEmotions: CARE_full cao nhất danh nghĩa (0.489) nhưng std=0.074 quá lớn → không ý nghĩa.</w:t>
+      </w:r>
+    </w:p>
+    <w:p>
+      <w:r>
+        <w:rPr>
+          <w:b/>
+        </w:rPr>
+        <w:t xml:space="preserve">Kết luận: </w:t>
+      </w:r>
+      <w:r>
+        <w:t>trên cả 3 bộ, CARE-Fusion KHÔNG vượt baseline mạnh nhất (text-only/cross-attn) một cách có ý nghĩa thống kê. CARE đạt trung bình tốt nhất trên bộ GIÀU EMOJI (VSMEC) và thắng các baseline hợp nhất đơn giản (concat/gated) ở toàn bộ 5 seed tại đó — gợi ý lợi ích của hợp nhất có cấu trúc TỈ LỆ với mật độ emoji, nhưng chưa đủ mạnh để khẳng định. Biểu tượng cảm xúc cải thiện rõ so với chỉ-text (đặc biệt VSMEC: 0.577→0.604), song hợp nhất đơn giản nhìn chung đã đủ.</w:t>
+      </w:r>
+    </w:p>
+    <w:p>
+      <w:pPr>
         <w:pStyle w:val="Heading1"/>
       </w:pPr>
       <w:r>

</xml_diff>